<commit_message>
chore(tbcd): cap nhat template Word thong bao cat dien (KCN 03/TH/TTI/YM)
Co-Authored-By: Claude Fable 5 <noreply@anthropic.com>
</commit_message>
<xml_diff>
--- a/public/TBCD-template/PO.KCN-03.docx
+++ b/public/TBCD-template/PO.KCN-03.docx
@@ -440,7 +440,39 @@
           <w:b/>
           <w:bCs/>
         </w:rPr>
-        <w:t xml:space="preserve">TẠM NGỪNG CẤP ĐIỆN </w:t>
+        <w:t xml:space="preserve">TẠM NGỪNG </w:t>
+      </w:r>
+      <w:proofErr w:type="spellStart"/>
+      <w:r>
+        <w:rPr>
+          <w:b/>
+          <w:bCs/>
+        </w:rPr>
+        <w:t>CẤP</w:t>
+      </w:r>
+      <w:proofErr w:type="spellEnd"/>
+      <w:r>
+        <w:rPr>
+          <w:b/>
+          <w:bCs/>
+        </w:rPr>
+        <w:t xml:space="preserve"> </w:t>
+      </w:r>
+      <w:proofErr w:type="spellStart"/>
+      <w:r>
+        <w:rPr>
+          <w:b/>
+          <w:bCs/>
+        </w:rPr>
+        <w:t>ĐIỆN</w:t>
+      </w:r>
+      <w:proofErr w:type="spellEnd"/>
+      <w:r>
+        <w:rPr>
+          <w:b/>
+          <w:bCs/>
+        </w:rPr>
+        <w:t xml:space="preserve"> </w:t>
       </w:r>
       <w:r>
         <w:rPr>
@@ -762,19 +794,19 @@
     <w:tbl>
       <w:tblPr>
         <w:tblStyle w:val="TableGrid"/>
-        <w:tblW w:w="0" w:type="auto"/>
+        <w:tblW w:w="8822" w:type="dxa"/>
         <w:tblLook w:val="04A0" w:firstRow="1" w:lastRow="0" w:firstColumn="1" w:lastColumn="0" w:noHBand="0" w:noVBand="1"/>
       </w:tblPr>
       <w:tblGrid>
-        <w:gridCol w:w="2115"/>
-        <w:gridCol w:w="1650"/>
-        <w:gridCol w:w="2050"/>
-        <w:gridCol w:w="3246"/>
+        <w:gridCol w:w="2131"/>
+        <w:gridCol w:w="2021"/>
+        <w:gridCol w:w="1277"/>
+        <w:gridCol w:w="3393"/>
       </w:tblGrid>
       <w:tr>
         <w:tc>
           <w:tcPr>
-            <w:tcW w:w="0" w:type="auto"/>
+            <w:tcW w:w="2115" w:type="dxa"/>
             <w:vAlign w:val="center"/>
           </w:tcPr>
           <w:p>
@@ -787,6 +819,7 @@
                 <w:bCs/>
               </w:rPr>
             </w:pPr>
+            <w:proofErr w:type="spellStart"/>
             <w:r>
               <w:rPr>
                 <w:rFonts w:eastAsia="MS Mincho"/>
@@ -795,11 +828,12 @@
               </w:rPr>
               <w:t>STT</w:t>
             </w:r>
+            <w:proofErr w:type="spellEnd"/>
           </w:p>
         </w:tc>
         <w:tc>
           <w:tcPr>
-            <w:tcW w:w="0" w:type="auto"/>
+            <w:tcW w:w="2025" w:type="dxa"/>
             <w:vAlign w:val="center"/>
           </w:tcPr>
           <w:p>
@@ -844,7 +878,7 @@
         </w:tc>
         <w:tc>
           <w:tcPr>
-            <w:tcW w:w="0" w:type="auto"/>
+            <w:tcW w:w="1280" w:type="dxa"/>
             <w:vAlign w:val="center"/>
           </w:tcPr>
           <w:p>
@@ -879,7 +913,7 @@
         </w:tc>
         <w:tc>
           <w:tcPr>
-            <w:tcW w:w="0" w:type="auto"/>
+            <w:tcW w:w="3402" w:type="dxa"/>
             <w:vAlign w:val="center"/>
           </w:tcPr>
           <w:p>
@@ -909,56 +943,7 @@
         </w:trPr>
         <w:tc>
           <w:tcPr>
-            <w:tcW w:w="0" w:type="auto"/>
-            <w:vAlign w:val="center"/>
-          </w:tcPr>
-          <w:p>
-            <w:pPr>
-              <w:spacing w:line="360" w:lineRule="auto"/>
-              <w:jc w:val="center"/>
-              <w:rPr>
-                <w:b/>
-                <w:bCs/>
-              </w:rPr>
-            </w:pPr>
-            <w:r>
-              <w:rPr>
-                <w:b/>
-                <w:bCs/>
-              </w:rPr>
-              <w:t>{#</w:t>
-            </w:r>
-            <w:proofErr w:type="gramStart"/>
-            <w:r>
-              <w:rPr>
-                <w:b/>
-                <w:bCs/>
-              </w:rPr>
-              <w:t>slots}{</w:t>
-            </w:r>
-            <w:proofErr w:type="gramEnd"/>
-            <w:r>
-              <w:rPr>
-                <w:b/>
-                <w:bCs/>
-              </w:rPr>
-              <w:t>slotIndex}</w:t>
-            </w:r>
-          </w:p>
-          <w:p>
-            <w:pPr>
-              <w:spacing w:line="360" w:lineRule="auto"/>
-              <w:jc w:val="center"/>
-              <w:rPr>
-                <w:b/>
-                <w:bCs/>
-              </w:rPr>
-            </w:pPr>
-          </w:p>
-        </w:tc>
-        <w:tc>
-          <w:tcPr>
-            <w:tcW w:w="0" w:type="auto"/>
+            <w:tcW w:w="2115" w:type="dxa"/>
             <w:vAlign w:val="center"/>
           </w:tcPr>
           <w:p>
@@ -967,27 +952,15 @@
               <w:jc w:val="center"/>
             </w:pPr>
             <w:r>
-              <w:rPr>
-                <w:b/>
-                <w:bCs/>
-              </w:rPr>
-              <w:t>{</w:t>
-            </w:r>
-            <w:proofErr w:type="spellStart"/>
-            <w:r>
-              <w:rPr>
-                <w:b/>
-                <w:bCs/>
-              </w:rPr>
-              <w:t>startTime</w:t>
-            </w:r>
-            <w:proofErr w:type="spellEnd"/>
-            <w:r>
-              <w:rPr>
-                <w:b/>
-                <w:bCs/>
-              </w:rPr>
-              <w:t>}</w:t>
+              <w:t>{#</w:t>
+            </w:r>
+            <w:proofErr w:type="gramStart"/>
+            <w:r>
+              <w:t>slots}{</w:t>
+            </w:r>
+            <w:proofErr w:type="gramEnd"/>
+            <w:r>
+              <w:t>slotIndex}</w:t>
             </w:r>
           </w:p>
           <w:p>
@@ -995,63 +968,50 @@
               <w:spacing w:line="360" w:lineRule="auto"/>
               <w:jc w:val="center"/>
               <w:rPr>
-                <w:rFonts w:eastAsia="MS Mincho"/>
+                <w:b/>
+                <w:bCs/>
               </w:rPr>
             </w:pPr>
-            <w:r>
-              <w:rPr>
-                <w:rFonts w:eastAsia="MS Mincho"/>
-              </w:rPr>
-              <w:t xml:space="preserve"> </w:t>
-            </w:r>
-            <w:proofErr w:type="spellStart"/>
-            <w:r>
-              <w:rPr>
-                <w:rFonts w:eastAsia="MS Mincho"/>
-              </w:rPr>
-              <w:t>đến</w:t>
-            </w:r>
-            <w:proofErr w:type="spellEnd"/>
-            <w:r>
-              <w:rPr>
-                <w:rFonts w:eastAsia="MS Mincho"/>
-              </w:rPr>
-              <w:t xml:space="preserve"> </w:t>
-            </w:r>
-            <w:r>
-              <w:rPr>
-                <w:b/>
-                <w:bCs/>
-              </w:rPr>
-              <w:t>{</w:t>
-            </w:r>
-            <w:proofErr w:type="spellStart"/>
-            <w:r>
-              <w:rPr>
-                <w:b/>
-                <w:bCs/>
-              </w:rPr>
-              <w:t>endTime</w:t>
-            </w:r>
-            <w:proofErr w:type="spellEnd"/>
-            <w:r>
-              <w:rPr>
-                <w:b/>
-                <w:bCs/>
-              </w:rPr>
-              <w:t>}</w:t>
-            </w:r>
           </w:p>
         </w:tc>
         <w:tc>
           <w:tcPr>
-            <w:tcW w:w="0" w:type="auto"/>
+            <w:tcW w:w="2025" w:type="dxa"/>
             <w:vAlign w:val="center"/>
           </w:tcPr>
           <w:p>
             <w:pPr>
               <w:spacing w:line="360" w:lineRule="auto"/>
               <w:jc w:val="center"/>
+            </w:pPr>
+            <w:r>
+              <w:rPr>
+                <w:b/>
+                <w:bCs/>
+              </w:rPr>
+              <w:t>{</w:t>
+            </w:r>
+            <w:proofErr w:type="spellStart"/>
+            <w:r>
+              <w:rPr>
+                <w:b/>
+                <w:bCs/>
+              </w:rPr>
+              <w:t>startTime</w:t>
+            </w:r>
+            <w:proofErr w:type="spellEnd"/>
+            <w:r>
+              <w:rPr>
+                <w:b/>
+                <w:bCs/>
+              </w:rPr>
+              <w:t>}</w:t>
+            </w:r>
+          </w:p>
+          <w:p>
+            <w:pPr>
+              <w:spacing w:line="360" w:lineRule="auto"/>
+              <w:jc w:val="center"/>
               <w:rPr>
                 <w:rFonts w:eastAsia="MS Mincho"/>
               </w:rPr>
@@ -1060,55 +1020,121 @@
               <w:rPr>
                 <w:rFonts w:eastAsia="MS Mincho"/>
               </w:rPr>
-              <w:t xml:space="preserve">KCN </w:t>
+              <w:t xml:space="preserve"> </w:t>
             </w:r>
             <w:proofErr w:type="spellStart"/>
             <w:r>
               <w:rPr>
                 <w:rFonts w:eastAsia="MS Mincho"/>
               </w:rPr>
-              <w:t>Số</w:t>
+              <w:t>đến</w:t>
             </w:r>
             <w:proofErr w:type="spellEnd"/>
             <w:r>
               <w:rPr>
                 <w:rFonts w:eastAsia="MS Mincho"/>
               </w:rPr>
-              <w:t xml:space="preserve"> 3, </w:t>
+              <w:t xml:space="preserve"> </w:t>
+            </w:r>
+            <w:r>
+              <w:rPr>
+                <w:b/>
+                <w:bCs/>
+              </w:rPr>
+              <w:t>{</w:t>
             </w:r>
             <w:proofErr w:type="spellStart"/>
             <w:r>
               <w:rPr>
-                <w:rFonts w:eastAsia="MS Mincho"/>
-              </w:rPr>
-              <w:t>tỉnh</w:t>
+                <w:b/>
+                <w:bCs/>
+              </w:rPr>
+              <w:t>endTime</w:t>
             </w:r>
             <w:proofErr w:type="spellEnd"/>
             <w:r>
               <w:rPr>
-                <w:rFonts w:eastAsia="MS Mincho"/>
-              </w:rPr>
-              <w:t xml:space="preserve"> </w:t>
-            </w:r>
-            <w:proofErr w:type="spellStart"/>
-            <w:r>
-              <w:rPr>
-                <w:rFonts w:eastAsia="MS Mincho"/>
-              </w:rPr>
-              <w:t>Hưng</w:t>
-            </w:r>
-            <w:proofErr w:type="spellEnd"/>
-            <w:r>
-              <w:rPr>
-                <w:rFonts w:eastAsia="MS Mincho"/>
-              </w:rPr>
-              <w:t xml:space="preserve"> Yên</w:t>
+                <w:b/>
+                <w:bCs/>
+              </w:rPr>
+              <w:t>}</w:t>
             </w:r>
           </w:p>
         </w:tc>
         <w:tc>
           <w:tcPr>
-            <w:tcW w:w="0" w:type="auto"/>
+            <w:tcW w:w="1280" w:type="dxa"/>
+            <w:vAlign w:val="center"/>
+          </w:tcPr>
+          <w:p>
+            <w:pPr>
+              <w:spacing w:line="360" w:lineRule="auto"/>
+              <w:jc w:val="center"/>
+              <w:rPr>
+                <w:rFonts w:eastAsia="MS Mincho"/>
+              </w:rPr>
+            </w:pPr>
+            <w:proofErr w:type="spellStart"/>
+            <w:r>
+              <w:rPr>
+                <w:rFonts w:eastAsia="MS Mincho"/>
+              </w:rPr>
+              <w:t>KCN</w:t>
+            </w:r>
+            <w:proofErr w:type="spellEnd"/>
+            <w:r>
+              <w:rPr>
+                <w:rFonts w:eastAsia="MS Mincho"/>
+              </w:rPr>
+              <w:t xml:space="preserve"> </w:t>
+            </w:r>
+            <w:proofErr w:type="spellStart"/>
+            <w:r>
+              <w:rPr>
+                <w:rFonts w:eastAsia="MS Mincho"/>
+              </w:rPr>
+              <w:t>Số</w:t>
+            </w:r>
+            <w:proofErr w:type="spellEnd"/>
+            <w:r>
+              <w:rPr>
+                <w:rFonts w:eastAsia="MS Mincho"/>
+              </w:rPr>
+              <w:t xml:space="preserve"> 3, </w:t>
+            </w:r>
+            <w:proofErr w:type="spellStart"/>
+            <w:r>
+              <w:rPr>
+                <w:rFonts w:eastAsia="MS Mincho"/>
+              </w:rPr>
+              <w:t>tỉnh</w:t>
+            </w:r>
+            <w:proofErr w:type="spellEnd"/>
+            <w:r>
+              <w:rPr>
+                <w:rFonts w:eastAsia="MS Mincho"/>
+              </w:rPr>
+              <w:t xml:space="preserve"> </w:t>
+            </w:r>
+            <w:proofErr w:type="spellStart"/>
+            <w:r>
+              <w:rPr>
+                <w:rFonts w:eastAsia="MS Mincho"/>
+              </w:rPr>
+              <w:t>Hưng</w:t>
+            </w:r>
+            <w:proofErr w:type="spellEnd"/>
+            <w:r>
+              <w:rPr>
+                <w:rFonts w:eastAsia="MS Mincho"/>
+              </w:rPr>
+              <w:t xml:space="preserve"> Yên</w:t>
+            </w:r>
+          </w:p>
+        </w:tc>
+        <w:tc>
+          <w:tcPr>
+            <w:tcW w:w="3402" w:type="dxa"/>
             <w:vAlign w:val="center"/>
           </w:tcPr>
           <w:p>
@@ -1706,12 +1732,20 @@
         </w:rPr>
         <w:t xml:space="preserve"> </w:t>
       </w:r>
-      <w:r>
-        <w:rPr>
-          <w:rFonts w:eastAsia="MS Mincho"/>
-        </w:rPr>
-        <w:t>my</w:t>
-      </w:r>
+      <w:proofErr w:type="spellStart"/>
+      <w:r>
+        <w:rPr>
+          <w:rFonts w:eastAsia="MS Mincho"/>
+        </w:rPr>
+        <w:t>m</w:t>
+      </w:r>
+      <w:r>
+        <w:rPr>
+          <w:rFonts w:eastAsia="MS Mincho"/>
+        </w:rPr>
+        <w:t>áy</w:t>
+      </w:r>
+      <w:proofErr w:type="spellEnd"/>
       <w:r>
         <w:rPr>
           <w:rFonts w:eastAsia="MS Mincho"/>
@@ -1880,8 +1914,17 @@
           <w:rFonts w:eastAsia="MS Mincho"/>
           <w:lang w:val="vi-VN"/>
         </w:rPr>
-        <w:t xml:space="preserve"> GELEX</w:t>
-      </w:r>
+        <w:t xml:space="preserve"> </w:t>
+      </w:r>
+      <w:proofErr w:type="spellStart"/>
+      <w:r>
+        <w:rPr>
+          <w:rFonts w:eastAsia="MS Mincho"/>
+          <w:lang w:val="vi-VN"/>
+        </w:rPr>
+        <w:t>GELEX</w:t>
+      </w:r>
+      <w:proofErr w:type="spellEnd"/>
       <w:r>
         <w:rPr>
           <w:rFonts w:eastAsia="MS Mincho"/>

</xml_diff>

<commit_message>
fix(tbcd): phu luc theo appendixIndex (khong theo so khung gio) + o nhap Khu vuc
- Template .docx (5 KCN): '(Dinh kem phu luc {slotIndex})' -> {appendixNum};
  cot Khu vuc co dinh -> placeholder {area}
- outageDocx: them appendixNum (theo appendixIndex) + area (fallback dia chi KCN)
- OutageSlot them area?; PowerOutageManager: SlotForm.areaText, o textarea sua duoc
  o cot Khu vuc, mac dinh dia chi day du theo KCN, doi KCN cap nhat cac slot chua sua;
  addSlot ke thua phu luc + Khu vuc cua khung gio truoc
- Da render-test docxtemplater: 2 khung gio chung phu luc 01 -> ca 2 in 'phu luc 01'

Co-Authored-By: Claude Fable 5 <noreply@anthropic.com>
</commit_message>
<xml_diff>
--- a/public/TBCD-template/PO.KCN-03.docx
+++ b/public/TBCD-template/PO.KCN-03.docx
@@ -1079,56 +1079,56 @@
               <w:rPr>
                 <w:rFonts w:eastAsia="MS Mincho"/>
               </w:rPr>
-              <w:t>KCN</w:t>
+              <w:t>{area}</w:t>
             </w:r>
             <w:proofErr w:type="spellEnd"/>
             <w:r>
               <w:rPr>
                 <w:rFonts w:eastAsia="MS Mincho"/>
               </w:rPr>
-              <w:t xml:space="preserve"> </w:t>
+              <w:t xml:space="preserve"/>
             </w:r>
             <w:proofErr w:type="spellStart"/>
             <w:r>
               <w:rPr>
                 <w:rFonts w:eastAsia="MS Mincho"/>
               </w:rPr>
-              <w:t>Số</w:t>
+              <w:t/>
             </w:r>
             <w:proofErr w:type="spellEnd"/>
             <w:r>
               <w:rPr>
                 <w:rFonts w:eastAsia="MS Mincho"/>
               </w:rPr>
-              <w:t xml:space="preserve"> 3, </w:t>
+              <w:t xml:space="preserve"/>
             </w:r>
             <w:proofErr w:type="spellStart"/>
             <w:r>
               <w:rPr>
                 <w:rFonts w:eastAsia="MS Mincho"/>
               </w:rPr>
-              <w:t>tỉnh</w:t>
+              <w:t/>
             </w:r>
             <w:proofErr w:type="spellEnd"/>
             <w:r>
               <w:rPr>
                 <w:rFonts w:eastAsia="MS Mincho"/>
               </w:rPr>
-              <w:t xml:space="preserve"> </w:t>
+              <w:t xml:space="preserve"/>
             </w:r>
             <w:proofErr w:type="spellStart"/>
             <w:r>
               <w:rPr>
                 <w:rFonts w:eastAsia="MS Mincho"/>
               </w:rPr>
-              <w:t>Hưng</w:t>
+              <w:t/>
             </w:r>
             <w:proofErr w:type="spellEnd"/>
             <w:r>
               <w:rPr>
                 <w:rFonts w:eastAsia="MS Mincho"/>
               </w:rPr>
-              <w:t xml:space="preserve"> Yên</w:t>
+              <w:t xml:space="preserve"/>
             </w:r>
           </w:p>
         </w:tc>
@@ -1251,7 +1251,7 @@
                 <w:i/>
                 <w:iCs/>
               </w:rPr>
-              <w:t>slotIndex</w:t>
+              <w:t>appendixNum</w:t>
             </w:r>
             <w:proofErr w:type="spellEnd"/>
             <w:proofErr w:type="gramStart"/>

</xml_diff>

<commit_message>
tweak(tbcd): Tien Hai = 'KCN Tien Hai tinh Hung Yen' + do rong cot bang khung gio
- AREA_ADDRESS Tien Hai bo 'xa Ai Quoc'
- 5 template .docx: cot STT 1.18cm(669) / Thoi gian 5.31cm(3010) / Khu vuc 4.25cm(2409)
  / Pham vi 5.24cm(2971) dxa; tblLayout fixed de Word ton trong dung do rong
- Da render-test lai docxtemplater ca 5 template

Co-Authored-By: Claude Fable 5 <noreply@anthropic.com>
</commit_message>
<xml_diff>
--- a/public/TBCD-template/PO.KCN-03.docx
+++ b/public/TBCD-template/PO.KCN-03.docx
@@ -794,19 +794,20 @@
     <w:tbl>
       <w:tblPr>
         <w:tblStyle w:val="TableGrid"/>
-        <w:tblW w:w="8822" w:type="dxa"/>
+        <w:tblW w:w="9059" w:type="dxa"/>
+        <w:tblLayout w:type="fixed"/>
         <w:tblLook w:val="04A0" w:firstRow="1" w:lastRow="0" w:firstColumn="1" w:lastColumn="0" w:noHBand="0" w:noVBand="1"/>
       </w:tblPr>
       <w:tblGrid>
-        <w:gridCol w:w="2131"/>
-        <w:gridCol w:w="2021"/>
-        <w:gridCol w:w="1277"/>
-        <w:gridCol w:w="3393"/>
+        <w:gridCol w:w="669"/>
+        <w:gridCol w:w="3010"/>
+        <w:gridCol w:w="2409"/>
+        <w:gridCol w:w="2971"/>
       </w:tblGrid>
       <w:tr>
         <w:tc>
           <w:tcPr>
-            <w:tcW w:w="2115" w:type="dxa"/>
+            <w:tcW w:w="669" w:type="dxa"/>
             <w:vAlign w:val="center"/>
           </w:tcPr>
           <w:p>
@@ -833,7 +834,7 @@
         </w:tc>
         <w:tc>
           <w:tcPr>
-            <w:tcW w:w="2025" w:type="dxa"/>
+            <w:tcW w:w="3010" w:type="dxa"/>
             <w:vAlign w:val="center"/>
           </w:tcPr>
           <w:p>
@@ -878,7 +879,7 @@
         </w:tc>
         <w:tc>
           <w:tcPr>
-            <w:tcW w:w="1280" w:type="dxa"/>
+            <w:tcW w:w="2409" w:type="dxa"/>
             <w:vAlign w:val="center"/>
           </w:tcPr>
           <w:p>
@@ -913,7 +914,7 @@
         </w:tc>
         <w:tc>
           <w:tcPr>
-            <w:tcW w:w="3402" w:type="dxa"/>
+            <w:tcW w:w="2971" w:type="dxa"/>
             <w:vAlign w:val="center"/>
           </w:tcPr>
           <w:p>
@@ -943,7 +944,7 @@
         </w:trPr>
         <w:tc>
           <w:tcPr>
-            <w:tcW w:w="2115" w:type="dxa"/>
+            <w:tcW w:w="669" w:type="dxa"/>
             <w:vAlign w:val="center"/>
           </w:tcPr>
           <w:p>
@@ -976,7 +977,7 @@
         </w:tc>
         <w:tc>
           <w:tcPr>
-            <w:tcW w:w="2025" w:type="dxa"/>
+            <w:tcW w:w="3010" w:type="dxa"/>
             <w:vAlign w:val="center"/>
           </w:tcPr>
           <w:p>
@@ -1063,7 +1064,7 @@
         </w:tc>
         <w:tc>
           <w:tcPr>
-            <w:tcW w:w="1280" w:type="dxa"/>
+            <w:tcW w:w="2409" w:type="dxa"/>
             <w:vAlign w:val="center"/>
           </w:tcPr>
           <w:p>
@@ -1134,7 +1135,7 @@
         </w:tc>
         <w:tc>
           <w:tcPr>
-            <w:tcW w:w="3402" w:type="dxa"/>
+            <w:tcW w:w="2971" w:type="dxa"/>
             <w:vAlign w:val="center"/>
           </w:tcPr>
           <w:p>

</xml_diff>